<commit_message>
Fix 6-agent demos: add conversational agent as Agent 1/6, update DOCX, renumber phases
</commit_message>
<xml_diff>
--- a/Dissertation_Project_Explanation.docx
+++ b/Dissertation_Project_Explanation.docx
@@ -1633,7 +1633,49 @@
           </w:tcPr>
           <w:p>
             <w:r>
-              <w:t>LLM calls per trip</w:t>
+              <w:t>LLM calls (full with conversation)</w:t>
+            </w:r>
+          </w:p>
+        </w:tc>
+        <w:tc>
+          <w:tcPr>
+            <w:tcW w:type="dxa" w:w="2160"/>
+          </w:tcPr>
+          <w:p>
+            <w:r>
+              <w:t>13</w:t>
+            </w:r>
+          </w:p>
+        </w:tc>
+        <w:tc>
+          <w:tcPr>
+            <w:tcW w:type="dxa" w:w="2160"/>
+          </w:tcPr>
+          <w:p>
+            <w:r>
+              <w:t>10</w:t>
+            </w:r>
+          </w:p>
+        </w:tc>
+        <w:tc>
+          <w:tcPr>
+            <w:tcW w:type="dxa" w:w="2160"/>
+          </w:tcPr>
+          <w:p>
+            <w:r>
+              <w:t>23% fewer</w:t>
+            </w:r>
+          </w:p>
+        </w:tc>
+      </w:tr>
+      <w:tr>
+        <w:tc>
+          <w:tcPr>
+            <w:tcW w:type="dxa" w:w="2160"/>
+          </w:tcPr>
+          <w:p>
+            <w:r>
+              <w:t>LLM calls (ablation — no conversation)</w:t>
             </w:r>
           </w:p>
         </w:tc>
@@ -1874,48 +1916,6 @@
           <w:p>
             <w:r>
               <w:t>Easier to maintain</w:t>
-            </w:r>
-          </w:p>
-        </w:tc>
-      </w:tr>
-      <w:tr>
-        <w:tc>
-          <w:tcPr>
-            <w:tcW w:type="dxa" w:w="2160"/>
-          </w:tcPr>
-          <w:p>
-            <w:r>
-              <w:t>API cost per trip</w:t>
-            </w:r>
-          </w:p>
-        </w:tc>
-        <w:tc>
-          <w:tcPr>
-            <w:tcW w:type="dxa" w:w="2160"/>
-          </w:tcPr>
-          <w:p>
-            <w:r>
-              <w:t>~$0.011</w:t>
-            </w:r>
-          </w:p>
-        </w:tc>
-        <w:tc>
-          <w:tcPr>
-            <w:tcW w:type="dxa" w:w="2160"/>
-          </w:tcPr>
-          <w:p>
-            <w:r>
-              <w:t>~$0.006</w:t>
-            </w:r>
-          </w:p>
-        </w:tc>
-        <w:tc>
-          <w:tcPr>
-            <w:tcW w:type="dxa" w:w="2160"/>
-          </w:tcPr>
-          <w:p>
-            <w:r>
-              <w:t>~45% cheaper</w:t>
             </w:r>
           </w:p>
         </w:tc>

</xml_diff>

<commit_message>
Fix DOCX: 12 MCP tools, 6-agent run, add litellm to pyproject.toml
</commit_message>
<xml_diff>
--- a/Dissertation_Project_Explanation.docx
+++ b/Dissertation_Project_Explanation.docx
@@ -1069,7 +1069,7 @@
         <w:pStyle w:val="ListBullet"/>
       </w:pPr>
       <w:r>
-        <w:t>Tools are registered: search flights, search hotels, search attractions, search restaurants, calculator, web search</w:t>
+        <w:t>12 tools are registered: search flights, search hotels, search accommodations, search car rentals, search web, search attractions, search restaurants, calculator, search hotel destination, search hotels by ID, get hotel reviews, get nearby attractions</w:t>
       </w:r>
     </w:p>
     <w:p>
@@ -2150,7 +2150,7 @@
           </w:tcPr>
           <w:p>
             <w:r>
-              <w:t>EXECUTION — Runs 5 agents one-by-one showing each agent call and raw output live.</w:t>
+              <w:t>EXECUTION — Runs 6 agents one-by-one (conversational → extractor → flight → hotel → attractions → coordinator) showing each agent call and raw output live.</w:t>
             </w:r>
           </w:p>
         </w:tc>
@@ -2612,7 +2612,7 @@
           </w:tcPr>
           <w:p>
             <w:r>
-              <w:t>Project dependencies — CrewAI 0.86.0, LiteLLM, Streamlit, etc.</w:t>
+              <w:t>Project dependencies — CrewAI 0.86.0, LiteLLM, Streamlit, LangChain, MCP SDK, Pydantic, Requests, etc.</w:t>
             </w:r>
           </w:p>
         </w:tc>

</xml_diff>